<commit_message>
yazdNegar 5 is not complete
</commit_message>
<xml_diff>
--- a/YazdNegar/Templates/Blank.docx
+++ b/YazdNegar/Templates/Blank.docx
@@ -1,6 +1,6 @@
 
 <file path=word/document.xml><?xml version="1.0" encoding="utf-8"?>
-<w:document xmlns:wpc="http://schemas.microsoft.com/office/word/2010/wordprocessingCanvas" xmlns:cx="http://schemas.microsoft.com/office/drawing/2014/chartex" xmlns:cx1="http://schemas.microsoft.com/office/drawing/2015/9/8/chartex" xmlns:cx2="http://schemas.microsoft.com/office/drawing/2015/10/21/chartex" xmlns:cx3="http://schemas.microsoft.com/office/drawing/2016/5/9/chartex" xmlns:cx4="http://schemas.microsoft.com/office/drawing/2016/5/10/chartex" xmlns:cx5="http://schemas.microsoft.com/office/drawing/2016/5/11/chartex" xmlns:cx6="http://schemas.microsoft.com/office/drawing/2016/5/12/chartex" xmlns:cx7="http://schemas.microsoft.com/office/drawing/2016/5/13/chartex" xmlns:cx8="http://schemas.microsoft.com/office/drawing/2016/5/14/chartex" xmlns:mc="http://schemas.openxmlformats.org/markup-compatibility/2006" xmlns:aink="http://schemas.microsoft.com/office/drawing/2016/ink" xmlns:am3d="http://schemas.microsoft.com/office/drawing/2017/model3d" xmlns:o="urn:schemas-microsoft-com:office:office" xmlns:r="http://schemas.openxmlformats.org/officeDocument/2006/relationships" xmlns:m="http://schemas.openxmlformats.org/officeDocument/2006/math" xmlns:v="urn:schemas-microsoft-com:vml" xmlns:wp14="http://schemas.microsoft.com/office/word/2010/wordprocessingDrawing" xmlns:wp="http://schemas.openxmlformats.org/drawingml/2006/wordprocessingDrawing" xmlns:w10="urn:schemas-microsoft-com:office:word" xmlns:w="http://schemas.openxmlformats.org/wordprocessingml/2006/main" xmlns:w14="http://schemas.microsoft.com/office/word/2010/wordml" xmlns:w15="http://schemas.microsoft.com/office/word/2012/wordml" xmlns:w16cid="http://schemas.microsoft.com/office/word/2016/wordml/cid" xmlns:w16se="http://schemas.microsoft.com/office/word/2015/wordml/symex" xmlns:wpg="http://schemas.microsoft.com/office/word/2010/wordprocessingGroup" xmlns:wpi="http://schemas.microsoft.com/office/word/2010/wordprocessingInk" xmlns:wne="http://schemas.microsoft.com/office/word/2006/wordml" xmlns:wps="http://schemas.microsoft.com/office/word/2010/wordprocessingShape" mc:Ignorable="w14 w15 w16se w16cid wp14">
+<w:document xmlns:wpc="http://schemas.microsoft.com/office/word/2010/wordprocessingCanvas" xmlns:cx="http://schemas.microsoft.com/office/drawing/2014/chartex" xmlns:cx1="http://schemas.microsoft.com/office/drawing/2015/9/8/chartex" xmlns:cx2="http://schemas.microsoft.com/office/drawing/2015/10/21/chartex" xmlns:cx3="http://schemas.microsoft.com/office/drawing/2016/5/9/chartex" xmlns:cx4="http://schemas.microsoft.com/office/drawing/2016/5/10/chartex" xmlns:cx5="http://schemas.microsoft.com/office/drawing/2016/5/11/chartex" xmlns:cx6="http://schemas.microsoft.com/office/drawing/2016/5/12/chartex" xmlns:cx7="http://schemas.microsoft.com/office/drawing/2016/5/13/chartex" xmlns:cx8="http://schemas.microsoft.com/office/drawing/2016/5/14/chartex" xmlns:mc="http://schemas.openxmlformats.org/markup-compatibility/2006" xmlns:aink="http://schemas.microsoft.com/office/drawing/2016/ink" xmlns:am3d="http://schemas.microsoft.com/office/drawing/2017/model3d" xmlns:o="urn:schemas-microsoft-com:office:office" xmlns:oel="http://schemas.microsoft.com/office/2019/extlst" xmlns:r="http://schemas.openxmlformats.org/officeDocument/2006/relationships" xmlns:m="http://schemas.openxmlformats.org/officeDocument/2006/math" xmlns:v="urn:schemas-microsoft-com:vml" xmlns:wp14="http://schemas.microsoft.com/office/word/2010/wordprocessingDrawing" xmlns:wp="http://schemas.openxmlformats.org/drawingml/2006/wordprocessingDrawing" xmlns:w10="urn:schemas-microsoft-com:office:word" xmlns:w="http://schemas.openxmlformats.org/wordprocessingml/2006/main" xmlns:w14="http://schemas.microsoft.com/office/word/2010/wordml" xmlns:w15="http://schemas.microsoft.com/office/word/2012/wordml" xmlns:w16cex="http://schemas.microsoft.com/office/word/2018/wordml/cex" xmlns:w16cid="http://schemas.microsoft.com/office/word/2016/wordml/cid" xmlns:w16="http://schemas.microsoft.com/office/word/2018/wordml" xmlns:w16sdtdh="http://schemas.microsoft.com/office/word/2020/wordml/sdtdatahash" xmlns:w16se="http://schemas.microsoft.com/office/word/2015/wordml/symex" xmlns:wpg="http://schemas.microsoft.com/office/word/2010/wordprocessingGroup" xmlns:wpi="http://schemas.microsoft.com/office/word/2010/wordprocessingInk" xmlns:wne="http://schemas.microsoft.com/office/word/2006/wordml" xmlns:wps="http://schemas.microsoft.com/office/word/2010/wordprocessingShape" mc:Ignorable="w14 w15 w16se w16cid w16 w16cex w16sdtdh wp14">
   <w:body>
     <w:p>
       <w:pPr>
@@ -11,12 +11,59 @@
         </w:numPr>
         <w:ind w:left="794"/>
         <w:rPr>
+          <w:rFonts w:hint="cs"/>
           <w:rtl/>
           <w:lang w:bidi="fa-IR"/>
         </w:rPr>
       </w:pPr>
-      <w:bookmarkStart w:id="0" w:name="_GoBack"/>
-      <w:bookmarkEnd w:id="0"/>
+      <w:del w:id="0" w:author="mohammad amin baghyani" w:date="2026-08-04T20:02:00Z">
+        <w:r>
+          <w:rPr>
+            <w:rFonts w:hint="cs"/>
+            <w:rtl/>
+            <w:lang w:bidi="fa-IR"/>
+          </w:rPr>
+          <w:delText>لل</w:delText>
+        </w:r>
+      </w:del>
+      <w:ins w:id="1" w:author="mohammad amin baghyani" w:date="2026-08-04T20:02:00Z">
+        <w:r>
+          <w:rPr>
+            <w:rFonts w:hint="cs"/>
+            <w:rtl/>
+            <w:lang w:bidi="fa-IR"/>
+          </w:rPr>
+          <w:t>ااااا</w:t>
+        </w:r>
+      </w:ins>
+      <w:r>
+        <w:rPr>
+          <w:rFonts w:hint="cs"/>
+          <w:rtl/>
+          <w:lang w:bidi="fa-IR"/>
+        </w:rPr>
+        <w:t xml:space="preserve"> </w:t>
+      </w:r>
+      <w:del w:id="2" w:author="mohammad amin baghyani" w:date="2026-08-04T20:02:00Z">
+        <w:r>
+          <w:rPr>
+            <w:rFonts w:hint="cs"/>
+            <w:rtl/>
+            <w:lang w:bidi="fa-IR"/>
+          </w:rPr>
+          <w:delText>للل</w:delText>
+        </w:r>
+      </w:del>
+      <w:ins w:id="3" w:author="mohammad amin baghyani" w:date="2026-08-04T20:02:00Z">
+        <w:r>
+          <w:rPr>
+            <w:rFonts w:hint="cs"/>
+            <w:rtl/>
+            <w:lang w:bidi="fa-IR"/>
+          </w:rPr>
+          <w:t>کمنتالب</w:t>
+        </w:r>
+      </w:ins>
     </w:p>
     <w:sectPr>
       <w:headerReference w:type="even" r:id="rId7"/>
@@ -39,7 +86,7 @@
 </file>
 
 <file path=word/endnotes.xml><?xml version="1.0" encoding="utf-8"?>
-<w:endnotes xmlns:wpc="http://schemas.microsoft.com/office/word/2010/wordprocessingCanvas" xmlns:cx="http://schemas.microsoft.com/office/drawing/2014/chartex" xmlns:cx1="http://schemas.microsoft.com/office/drawing/2015/9/8/chartex" xmlns:cx2="http://schemas.microsoft.com/office/drawing/2015/10/21/chartex" xmlns:cx3="http://schemas.microsoft.com/office/drawing/2016/5/9/chartex" xmlns:cx4="http://schemas.microsoft.com/office/drawing/2016/5/10/chartex" xmlns:cx5="http://schemas.microsoft.com/office/drawing/2016/5/11/chartex" xmlns:cx6="http://schemas.microsoft.com/office/drawing/2016/5/12/chartex" xmlns:cx7="http://schemas.microsoft.com/office/drawing/2016/5/13/chartex" xmlns:cx8="http://schemas.microsoft.com/office/drawing/2016/5/14/chartex" xmlns:mc="http://schemas.openxmlformats.org/markup-compatibility/2006" xmlns:aink="http://schemas.microsoft.com/office/drawing/2016/ink" xmlns:am3d="http://schemas.microsoft.com/office/drawing/2017/model3d" xmlns:o="urn:schemas-microsoft-com:office:office" xmlns:r="http://schemas.openxmlformats.org/officeDocument/2006/relationships" xmlns:m="http://schemas.openxmlformats.org/officeDocument/2006/math" xmlns:v="urn:schemas-microsoft-com:vml" xmlns:wp14="http://schemas.microsoft.com/office/word/2010/wordprocessingDrawing" xmlns:wp="http://schemas.openxmlformats.org/drawingml/2006/wordprocessingDrawing" xmlns:w10="urn:schemas-microsoft-com:office:word" xmlns:w="http://schemas.openxmlformats.org/wordprocessingml/2006/main" xmlns:w14="http://schemas.microsoft.com/office/word/2010/wordml" xmlns:w15="http://schemas.microsoft.com/office/word/2012/wordml" xmlns:w16cid="http://schemas.microsoft.com/office/word/2016/wordml/cid" xmlns:w16se="http://schemas.microsoft.com/office/word/2015/wordml/symex" xmlns:wpg="http://schemas.microsoft.com/office/word/2010/wordprocessingGroup" xmlns:wpi="http://schemas.microsoft.com/office/word/2010/wordprocessingInk" xmlns:wne="http://schemas.microsoft.com/office/word/2006/wordml" xmlns:wps="http://schemas.microsoft.com/office/word/2010/wordprocessingShape" mc:Ignorable="w14 w15 w16se w16cid wp14">
+<w:endnotes xmlns:wpc="http://schemas.microsoft.com/office/word/2010/wordprocessingCanvas" xmlns:cx="http://schemas.microsoft.com/office/drawing/2014/chartex" xmlns:cx1="http://schemas.microsoft.com/office/drawing/2015/9/8/chartex" xmlns:cx2="http://schemas.microsoft.com/office/drawing/2015/10/21/chartex" xmlns:cx3="http://schemas.microsoft.com/office/drawing/2016/5/9/chartex" xmlns:cx4="http://schemas.microsoft.com/office/drawing/2016/5/10/chartex" xmlns:cx5="http://schemas.microsoft.com/office/drawing/2016/5/11/chartex" xmlns:cx6="http://schemas.microsoft.com/office/drawing/2016/5/12/chartex" xmlns:cx7="http://schemas.microsoft.com/office/drawing/2016/5/13/chartex" xmlns:cx8="http://schemas.microsoft.com/office/drawing/2016/5/14/chartex" xmlns:mc="http://schemas.openxmlformats.org/markup-compatibility/2006" xmlns:aink="http://schemas.microsoft.com/office/drawing/2016/ink" xmlns:am3d="http://schemas.microsoft.com/office/drawing/2017/model3d" xmlns:o="urn:schemas-microsoft-com:office:office" xmlns:oel="http://schemas.microsoft.com/office/2019/extlst" xmlns:r="http://schemas.openxmlformats.org/officeDocument/2006/relationships" xmlns:m="http://schemas.openxmlformats.org/officeDocument/2006/math" xmlns:v="urn:schemas-microsoft-com:vml" xmlns:wp14="http://schemas.microsoft.com/office/word/2010/wordprocessingDrawing" xmlns:wp="http://schemas.openxmlformats.org/drawingml/2006/wordprocessingDrawing" xmlns:w10="urn:schemas-microsoft-com:office:word" xmlns:w="http://schemas.openxmlformats.org/wordprocessingml/2006/main" xmlns:w14="http://schemas.microsoft.com/office/word/2010/wordml" xmlns:w15="http://schemas.microsoft.com/office/word/2012/wordml" xmlns:w16cex="http://schemas.microsoft.com/office/word/2018/wordml/cex" xmlns:w16cid="http://schemas.microsoft.com/office/word/2016/wordml/cid" xmlns:w16="http://schemas.microsoft.com/office/word/2018/wordml" xmlns:w16sdtdh="http://schemas.microsoft.com/office/word/2020/wordml/sdtdatahash" xmlns:w16se="http://schemas.microsoft.com/office/word/2015/wordml/symex" xmlns:wpg="http://schemas.microsoft.com/office/word/2010/wordprocessingGroup" xmlns:wpi="http://schemas.microsoft.com/office/word/2010/wordprocessingInk" xmlns:wne="http://schemas.microsoft.com/office/word/2006/wordml" xmlns:wps="http://schemas.microsoft.com/office/word/2010/wordprocessingShape" mc:Ignorable="w14 w15 w16se w16cid w16 w16cex w16sdtdh wp14">
   <w:endnote w:type="separator" w:id="-1">
     <w:p>
       <w:pPr>
@@ -64,7 +111,7 @@
 </file>
 
 <file path=word/footer1.xml><?xml version="1.0" encoding="utf-8"?>
-<w:ftr xmlns:wpc="http://schemas.microsoft.com/office/word/2010/wordprocessingCanvas" xmlns:cx="http://schemas.microsoft.com/office/drawing/2014/chartex" xmlns:cx1="http://schemas.microsoft.com/office/drawing/2015/9/8/chartex" xmlns:cx2="http://schemas.microsoft.com/office/drawing/2015/10/21/chartex" xmlns:cx3="http://schemas.microsoft.com/office/drawing/2016/5/9/chartex" xmlns:cx4="http://schemas.microsoft.com/office/drawing/2016/5/10/chartex" xmlns:cx5="http://schemas.microsoft.com/office/drawing/2016/5/11/chartex" xmlns:cx6="http://schemas.microsoft.com/office/drawing/2016/5/12/chartex" xmlns:cx7="http://schemas.microsoft.com/office/drawing/2016/5/13/chartex" xmlns:cx8="http://schemas.microsoft.com/office/drawing/2016/5/14/chartex" xmlns:mc="http://schemas.openxmlformats.org/markup-compatibility/2006" xmlns:aink="http://schemas.microsoft.com/office/drawing/2016/ink" xmlns:am3d="http://schemas.microsoft.com/office/drawing/2017/model3d" xmlns:o="urn:schemas-microsoft-com:office:office" xmlns:r="http://schemas.openxmlformats.org/officeDocument/2006/relationships" xmlns:m="http://schemas.openxmlformats.org/officeDocument/2006/math" xmlns:v="urn:schemas-microsoft-com:vml" xmlns:wp14="http://schemas.microsoft.com/office/word/2010/wordprocessingDrawing" xmlns:wp="http://schemas.openxmlformats.org/drawingml/2006/wordprocessingDrawing" xmlns:w10="urn:schemas-microsoft-com:office:word" xmlns:w="http://schemas.openxmlformats.org/wordprocessingml/2006/main" xmlns:w14="http://schemas.microsoft.com/office/word/2010/wordml" xmlns:w15="http://schemas.microsoft.com/office/word/2012/wordml" xmlns:w16cid="http://schemas.microsoft.com/office/word/2016/wordml/cid" xmlns:w16se="http://schemas.microsoft.com/office/word/2015/wordml/symex" xmlns:wpg="http://schemas.microsoft.com/office/word/2010/wordprocessingGroup" xmlns:wpi="http://schemas.microsoft.com/office/word/2010/wordprocessingInk" xmlns:wne="http://schemas.microsoft.com/office/word/2006/wordml" xmlns:wps="http://schemas.microsoft.com/office/word/2010/wordprocessingShape" mc:Ignorable="w14 w15 w16se w16cid wp14">
+<w:ftr xmlns:wpc="http://schemas.microsoft.com/office/word/2010/wordprocessingCanvas" xmlns:cx="http://schemas.microsoft.com/office/drawing/2014/chartex" xmlns:cx1="http://schemas.microsoft.com/office/drawing/2015/9/8/chartex" xmlns:cx2="http://schemas.microsoft.com/office/drawing/2015/10/21/chartex" xmlns:cx3="http://schemas.microsoft.com/office/drawing/2016/5/9/chartex" xmlns:cx4="http://schemas.microsoft.com/office/drawing/2016/5/10/chartex" xmlns:cx5="http://schemas.microsoft.com/office/drawing/2016/5/11/chartex" xmlns:cx6="http://schemas.microsoft.com/office/drawing/2016/5/12/chartex" xmlns:cx7="http://schemas.microsoft.com/office/drawing/2016/5/13/chartex" xmlns:cx8="http://schemas.microsoft.com/office/drawing/2016/5/14/chartex" xmlns:mc="http://schemas.openxmlformats.org/markup-compatibility/2006" xmlns:aink="http://schemas.microsoft.com/office/drawing/2016/ink" xmlns:am3d="http://schemas.microsoft.com/office/drawing/2017/model3d" xmlns:o="urn:schemas-microsoft-com:office:office" xmlns:oel="http://schemas.microsoft.com/office/2019/extlst" xmlns:r="http://schemas.openxmlformats.org/officeDocument/2006/relationships" xmlns:m="http://schemas.openxmlformats.org/officeDocument/2006/math" xmlns:v="urn:schemas-microsoft-com:vml" xmlns:wp14="http://schemas.microsoft.com/office/word/2010/wordprocessingDrawing" xmlns:wp="http://schemas.openxmlformats.org/drawingml/2006/wordprocessingDrawing" xmlns:w10="urn:schemas-microsoft-com:office:word" xmlns:w="http://schemas.openxmlformats.org/wordprocessingml/2006/main" xmlns:w14="http://schemas.microsoft.com/office/word/2010/wordml" xmlns:w15="http://schemas.microsoft.com/office/word/2012/wordml" xmlns:w16cex="http://schemas.microsoft.com/office/word/2018/wordml/cex" xmlns:w16cid="http://schemas.microsoft.com/office/word/2016/wordml/cid" xmlns:w16="http://schemas.microsoft.com/office/word/2018/wordml" xmlns:w16sdtdh="http://schemas.microsoft.com/office/word/2020/wordml/sdtdatahash" xmlns:w16se="http://schemas.microsoft.com/office/word/2015/wordml/symex" xmlns:wpg="http://schemas.microsoft.com/office/word/2010/wordprocessingGroup" xmlns:wpi="http://schemas.microsoft.com/office/word/2010/wordprocessingInk" xmlns:wne="http://schemas.microsoft.com/office/word/2006/wordml" xmlns:wps="http://schemas.microsoft.com/office/word/2010/wordprocessingShape" mc:Ignorable="w14 w15 w16se w16cid w16 w16cex w16sdtdh wp14">
   <w:p>
     <w:pPr>
       <w:pStyle w:val="Footer"/>
@@ -74,7 +121,7 @@
 </file>
 
 <file path=word/footer2.xml><?xml version="1.0" encoding="utf-8"?>
-<w:ftr xmlns:wpc="http://schemas.microsoft.com/office/word/2010/wordprocessingCanvas" xmlns:cx="http://schemas.microsoft.com/office/drawing/2014/chartex" xmlns:cx1="http://schemas.microsoft.com/office/drawing/2015/9/8/chartex" xmlns:cx2="http://schemas.microsoft.com/office/drawing/2015/10/21/chartex" xmlns:cx3="http://schemas.microsoft.com/office/drawing/2016/5/9/chartex" xmlns:cx4="http://schemas.microsoft.com/office/drawing/2016/5/10/chartex" xmlns:cx5="http://schemas.microsoft.com/office/drawing/2016/5/11/chartex" xmlns:cx6="http://schemas.microsoft.com/office/drawing/2016/5/12/chartex" xmlns:cx7="http://schemas.microsoft.com/office/drawing/2016/5/13/chartex" xmlns:cx8="http://schemas.microsoft.com/office/drawing/2016/5/14/chartex" xmlns:mc="http://schemas.openxmlformats.org/markup-compatibility/2006" xmlns:aink="http://schemas.microsoft.com/office/drawing/2016/ink" xmlns:am3d="http://schemas.microsoft.com/office/drawing/2017/model3d" xmlns:o="urn:schemas-microsoft-com:office:office" xmlns:r="http://schemas.openxmlformats.org/officeDocument/2006/relationships" xmlns:m="http://schemas.openxmlformats.org/officeDocument/2006/math" xmlns:v="urn:schemas-microsoft-com:vml" xmlns:wp14="http://schemas.microsoft.com/office/word/2010/wordprocessingDrawing" xmlns:wp="http://schemas.openxmlformats.org/drawingml/2006/wordprocessingDrawing" xmlns:w10="urn:schemas-microsoft-com:office:word" xmlns:w="http://schemas.openxmlformats.org/wordprocessingml/2006/main" xmlns:w14="http://schemas.microsoft.com/office/word/2010/wordml" xmlns:w15="http://schemas.microsoft.com/office/word/2012/wordml" xmlns:w16cid="http://schemas.microsoft.com/office/word/2016/wordml/cid" xmlns:w16se="http://schemas.microsoft.com/office/word/2015/wordml/symex" xmlns:wpg="http://schemas.microsoft.com/office/word/2010/wordprocessingGroup" xmlns:wpi="http://schemas.microsoft.com/office/word/2010/wordprocessingInk" xmlns:wne="http://schemas.microsoft.com/office/word/2006/wordml" xmlns:wps="http://schemas.microsoft.com/office/word/2010/wordprocessingShape" mc:Ignorable="w14 w15 w16se w16cid wp14">
+<w:ftr xmlns:wpc="http://schemas.microsoft.com/office/word/2010/wordprocessingCanvas" xmlns:cx="http://schemas.microsoft.com/office/drawing/2014/chartex" xmlns:cx1="http://schemas.microsoft.com/office/drawing/2015/9/8/chartex" xmlns:cx2="http://schemas.microsoft.com/office/drawing/2015/10/21/chartex" xmlns:cx3="http://schemas.microsoft.com/office/drawing/2016/5/9/chartex" xmlns:cx4="http://schemas.microsoft.com/office/drawing/2016/5/10/chartex" xmlns:cx5="http://schemas.microsoft.com/office/drawing/2016/5/11/chartex" xmlns:cx6="http://schemas.microsoft.com/office/drawing/2016/5/12/chartex" xmlns:cx7="http://schemas.microsoft.com/office/drawing/2016/5/13/chartex" xmlns:cx8="http://schemas.microsoft.com/office/drawing/2016/5/14/chartex" xmlns:mc="http://schemas.openxmlformats.org/markup-compatibility/2006" xmlns:aink="http://schemas.microsoft.com/office/drawing/2016/ink" xmlns:am3d="http://schemas.microsoft.com/office/drawing/2017/model3d" xmlns:o="urn:schemas-microsoft-com:office:office" xmlns:oel="http://schemas.microsoft.com/office/2019/extlst" xmlns:r="http://schemas.openxmlformats.org/officeDocument/2006/relationships" xmlns:m="http://schemas.openxmlformats.org/officeDocument/2006/math" xmlns:v="urn:schemas-microsoft-com:vml" xmlns:wp14="http://schemas.microsoft.com/office/word/2010/wordprocessingDrawing" xmlns:wp="http://schemas.openxmlformats.org/drawingml/2006/wordprocessingDrawing" xmlns:w10="urn:schemas-microsoft-com:office:word" xmlns:w="http://schemas.openxmlformats.org/wordprocessingml/2006/main" xmlns:w14="http://schemas.microsoft.com/office/word/2010/wordml" xmlns:w15="http://schemas.microsoft.com/office/word/2012/wordml" xmlns:w16cex="http://schemas.microsoft.com/office/word/2018/wordml/cex" xmlns:w16cid="http://schemas.microsoft.com/office/word/2016/wordml/cid" xmlns:w16="http://schemas.microsoft.com/office/word/2018/wordml" xmlns:w16sdtdh="http://schemas.microsoft.com/office/word/2020/wordml/sdtdatahash" xmlns:w16se="http://schemas.microsoft.com/office/word/2015/wordml/symex" xmlns:wpg="http://schemas.microsoft.com/office/word/2010/wordprocessingGroup" xmlns:wpi="http://schemas.microsoft.com/office/word/2010/wordprocessingInk" xmlns:wne="http://schemas.microsoft.com/office/word/2006/wordml" xmlns:wps="http://schemas.microsoft.com/office/word/2010/wordprocessingShape" mc:Ignorable="w14 w15 w16se w16cid w16 w16cex w16sdtdh wp14">
   <w:p>
     <w:pPr>
       <w:pStyle w:val="Footer"/>
@@ -89,7 +136,7 @@
 </file>
 
 <file path=word/footer3.xml><?xml version="1.0" encoding="utf-8"?>
-<w:ftr xmlns:wpc="http://schemas.microsoft.com/office/word/2010/wordprocessingCanvas" xmlns:cx="http://schemas.microsoft.com/office/drawing/2014/chartex" xmlns:cx1="http://schemas.microsoft.com/office/drawing/2015/9/8/chartex" xmlns:cx2="http://schemas.microsoft.com/office/drawing/2015/10/21/chartex" xmlns:cx3="http://schemas.microsoft.com/office/drawing/2016/5/9/chartex" xmlns:cx4="http://schemas.microsoft.com/office/drawing/2016/5/10/chartex" xmlns:cx5="http://schemas.microsoft.com/office/drawing/2016/5/11/chartex" xmlns:cx6="http://schemas.microsoft.com/office/drawing/2016/5/12/chartex" xmlns:cx7="http://schemas.microsoft.com/office/drawing/2016/5/13/chartex" xmlns:cx8="http://schemas.microsoft.com/office/drawing/2016/5/14/chartex" xmlns:mc="http://schemas.openxmlformats.org/markup-compatibility/2006" xmlns:aink="http://schemas.microsoft.com/office/drawing/2016/ink" xmlns:am3d="http://schemas.microsoft.com/office/drawing/2017/model3d" xmlns:o="urn:schemas-microsoft-com:office:office" xmlns:r="http://schemas.openxmlformats.org/officeDocument/2006/relationships" xmlns:m="http://schemas.openxmlformats.org/officeDocument/2006/math" xmlns:v="urn:schemas-microsoft-com:vml" xmlns:wp14="http://schemas.microsoft.com/office/word/2010/wordprocessingDrawing" xmlns:wp="http://schemas.openxmlformats.org/drawingml/2006/wordprocessingDrawing" xmlns:w10="urn:schemas-microsoft-com:office:word" xmlns:w="http://schemas.openxmlformats.org/wordprocessingml/2006/main" xmlns:w14="http://schemas.microsoft.com/office/word/2010/wordml" xmlns:w15="http://schemas.microsoft.com/office/word/2012/wordml" xmlns:w16cid="http://schemas.microsoft.com/office/word/2016/wordml/cid" xmlns:w16se="http://schemas.microsoft.com/office/word/2015/wordml/symex" xmlns:wpg="http://schemas.microsoft.com/office/word/2010/wordprocessingGroup" xmlns:wpi="http://schemas.microsoft.com/office/word/2010/wordprocessingInk" xmlns:wne="http://schemas.microsoft.com/office/word/2006/wordml" xmlns:wps="http://schemas.microsoft.com/office/word/2010/wordprocessingShape" mc:Ignorable="w14 w15 w16se w16cid wp14">
+<w:ftr xmlns:wpc="http://schemas.microsoft.com/office/word/2010/wordprocessingCanvas" xmlns:cx="http://schemas.microsoft.com/office/drawing/2014/chartex" xmlns:cx1="http://schemas.microsoft.com/office/drawing/2015/9/8/chartex" xmlns:cx2="http://schemas.microsoft.com/office/drawing/2015/10/21/chartex" xmlns:cx3="http://schemas.microsoft.com/office/drawing/2016/5/9/chartex" xmlns:cx4="http://schemas.microsoft.com/office/drawing/2016/5/10/chartex" xmlns:cx5="http://schemas.microsoft.com/office/drawing/2016/5/11/chartex" xmlns:cx6="http://schemas.microsoft.com/office/drawing/2016/5/12/chartex" xmlns:cx7="http://schemas.microsoft.com/office/drawing/2016/5/13/chartex" xmlns:cx8="http://schemas.microsoft.com/office/drawing/2016/5/14/chartex" xmlns:mc="http://schemas.openxmlformats.org/markup-compatibility/2006" xmlns:aink="http://schemas.microsoft.com/office/drawing/2016/ink" xmlns:am3d="http://schemas.microsoft.com/office/drawing/2017/model3d" xmlns:o="urn:schemas-microsoft-com:office:office" xmlns:oel="http://schemas.microsoft.com/office/2019/extlst" xmlns:r="http://schemas.openxmlformats.org/officeDocument/2006/relationships" xmlns:m="http://schemas.openxmlformats.org/officeDocument/2006/math" xmlns:v="urn:schemas-microsoft-com:vml" xmlns:wp14="http://schemas.microsoft.com/office/word/2010/wordprocessingDrawing" xmlns:wp="http://schemas.openxmlformats.org/drawingml/2006/wordprocessingDrawing" xmlns:w10="urn:schemas-microsoft-com:office:word" xmlns:w="http://schemas.openxmlformats.org/wordprocessingml/2006/main" xmlns:w14="http://schemas.microsoft.com/office/word/2010/wordml" xmlns:w15="http://schemas.microsoft.com/office/word/2012/wordml" xmlns:w16cex="http://schemas.microsoft.com/office/word/2018/wordml/cex" xmlns:w16cid="http://schemas.microsoft.com/office/word/2016/wordml/cid" xmlns:w16="http://schemas.microsoft.com/office/word/2018/wordml" xmlns:w16sdtdh="http://schemas.microsoft.com/office/word/2020/wordml/sdtdatahash" xmlns:w16se="http://schemas.microsoft.com/office/word/2015/wordml/symex" xmlns:wpg="http://schemas.microsoft.com/office/word/2010/wordprocessingGroup" xmlns:wpi="http://schemas.microsoft.com/office/word/2010/wordprocessingInk" xmlns:wne="http://schemas.microsoft.com/office/word/2006/wordml" xmlns:wps="http://schemas.microsoft.com/office/word/2010/wordprocessingShape" mc:Ignorable="w14 w15 w16se w16cid w16 w16cex w16sdtdh wp14">
   <w:p>
     <w:pPr>
       <w:pStyle w:val="Footer"/>
@@ -99,7 +146,7 @@
 </file>
 
 <file path=word/footnotes.xml><?xml version="1.0" encoding="utf-8"?>
-<w:footnotes xmlns:wpc="http://schemas.microsoft.com/office/word/2010/wordprocessingCanvas" xmlns:cx="http://schemas.microsoft.com/office/drawing/2014/chartex" xmlns:cx1="http://schemas.microsoft.com/office/drawing/2015/9/8/chartex" xmlns:cx2="http://schemas.microsoft.com/office/drawing/2015/10/21/chartex" xmlns:cx3="http://schemas.microsoft.com/office/drawing/2016/5/9/chartex" xmlns:cx4="http://schemas.microsoft.com/office/drawing/2016/5/10/chartex" xmlns:cx5="http://schemas.microsoft.com/office/drawing/2016/5/11/chartex" xmlns:cx6="http://schemas.microsoft.com/office/drawing/2016/5/12/chartex" xmlns:cx7="http://schemas.microsoft.com/office/drawing/2016/5/13/chartex" xmlns:cx8="http://schemas.microsoft.com/office/drawing/2016/5/14/chartex" xmlns:mc="http://schemas.openxmlformats.org/markup-compatibility/2006" xmlns:aink="http://schemas.microsoft.com/office/drawing/2016/ink" xmlns:am3d="http://schemas.microsoft.com/office/drawing/2017/model3d" xmlns:o="urn:schemas-microsoft-com:office:office" xmlns:r="http://schemas.openxmlformats.org/officeDocument/2006/relationships" xmlns:m="http://schemas.openxmlformats.org/officeDocument/2006/math" xmlns:v="urn:schemas-microsoft-com:vml" xmlns:wp14="http://schemas.microsoft.com/office/word/2010/wordprocessingDrawing" xmlns:wp="http://schemas.openxmlformats.org/drawingml/2006/wordprocessingDrawing" xmlns:w10="urn:schemas-microsoft-com:office:word" xmlns:w="http://schemas.openxmlformats.org/wordprocessingml/2006/main" xmlns:w14="http://schemas.microsoft.com/office/word/2010/wordml" xmlns:w15="http://schemas.microsoft.com/office/word/2012/wordml" xmlns:w16cid="http://schemas.microsoft.com/office/word/2016/wordml/cid" xmlns:w16se="http://schemas.microsoft.com/office/word/2015/wordml/symex" xmlns:wpg="http://schemas.microsoft.com/office/word/2010/wordprocessingGroup" xmlns:wpi="http://schemas.microsoft.com/office/word/2010/wordprocessingInk" xmlns:wne="http://schemas.microsoft.com/office/word/2006/wordml" xmlns:wps="http://schemas.microsoft.com/office/word/2010/wordprocessingShape" mc:Ignorable="w14 w15 w16se w16cid wp14">
+<w:footnotes xmlns:wpc="http://schemas.microsoft.com/office/word/2010/wordprocessingCanvas" xmlns:cx="http://schemas.microsoft.com/office/drawing/2014/chartex" xmlns:cx1="http://schemas.microsoft.com/office/drawing/2015/9/8/chartex" xmlns:cx2="http://schemas.microsoft.com/office/drawing/2015/10/21/chartex" xmlns:cx3="http://schemas.microsoft.com/office/drawing/2016/5/9/chartex" xmlns:cx4="http://schemas.microsoft.com/office/drawing/2016/5/10/chartex" xmlns:cx5="http://schemas.microsoft.com/office/drawing/2016/5/11/chartex" xmlns:cx6="http://schemas.microsoft.com/office/drawing/2016/5/12/chartex" xmlns:cx7="http://schemas.microsoft.com/office/drawing/2016/5/13/chartex" xmlns:cx8="http://schemas.microsoft.com/office/drawing/2016/5/14/chartex" xmlns:mc="http://schemas.openxmlformats.org/markup-compatibility/2006" xmlns:aink="http://schemas.microsoft.com/office/drawing/2016/ink" xmlns:am3d="http://schemas.microsoft.com/office/drawing/2017/model3d" xmlns:o="urn:schemas-microsoft-com:office:office" xmlns:oel="http://schemas.microsoft.com/office/2019/extlst" xmlns:r="http://schemas.openxmlformats.org/officeDocument/2006/relationships" xmlns:m="http://schemas.openxmlformats.org/officeDocument/2006/math" xmlns:v="urn:schemas-microsoft-com:vml" xmlns:wp14="http://schemas.microsoft.com/office/word/2010/wordprocessingDrawing" xmlns:wp="http://schemas.openxmlformats.org/drawingml/2006/wordprocessingDrawing" xmlns:w10="urn:schemas-microsoft-com:office:word" xmlns:w="http://schemas.openxmlformats.org/wordprocessingml/2006/main" xmlns:w14="http://schemas.microsoft.com/office/word/2010/wordml" xmlns:w15="http://schemas.microsoft.com/office/word/2012/wordml" xmlns:w16cex="http://schemas.microsoft.com/office/word/2018/wordml/cex" xmlns:w16cid="http://schemas.microsoft.com/office/word/2016/wordml/cid" xmlns:w16="http://schemas.microsoft.com/office/word/2018/wordml" xmlns:w16sdtdh="http://schemas.microsoft.com/office/word/2020/wordml/sdtdatahash" xmlns:w16se="http://schemas.microsoft.com/office/word/2015/wordml/symex" xmlns:wpg="http://schemas.microsoft.com/office/word/2010/wordprocessingGroup" xmlns:wpi="http://schemas.microsoft.com/office/word/2010/wordprocessingInk" xmlns:wne="http://schemas.microsoft.com/office/word/2006/wordml" xmlns:wps="http://schemas.microsoft.com/office/word/2010/wordprocessingShape" mc:Ignorable="w14 w15 w16se w16cid w16 w16cex w16sdtdh wp14">
   <w:footnote w:type="separator" w:id="-1">
     <w:p>
       <w:pPr>
@@ -124,7 +171,7 @@
 </file>
 
 <file path=word/header1.xml><?xml version="1.0" encoding="utf-8"?>
-<w:hdr xmlns:wpc="http://schemas.microsoft.com/office/word/2010/wordprocessingCanvas" xmlns:cx="http://schemas.microsoft.com/office/drawing/2014/chartex" xmlns:cx1="http://schemas.microsoft.com/office/drawing/2015/9/8/chartex" xmlns:cx2="http://schemas.microsoft.com/office/drawing/2015/10/21/chartex" xmlns:cx3="http://schemas.microsoft.com/office/drawing/2016/5/9/chartex" xmlns:cx4="http://schemas.microsoft.com/office/drawing/2016/5/10/chartex" xmlns:cx5="http://schemas.microsoft.com/office/drawing/2016/5/11/chartex" xmlns:cx6="http://schemas.microsoft.com/office/drawing/2016/5/12/chartex" xmlns:cx7="http://schemas.microsoft.com/office/drawing/2016/5/13/chartex" xmlns:cx8="http://schemas.microsoft.com/office/drawing/2016/5/14/chartex" xmlns:mc="http://schemas.openxmlformats.org/markup-compatibility/2006" xmlns:aink="http://schemas.microsoft.com/office/drawing/2016/ink" xmlns:am3d="http://schemas.microsoft.com/office/drawing/2017/model3d" xmlns:o="urn:schemas-microsoft-com:office:office" xmlns:r="http://schemas.openxmlformats.org/officeDocument/2006/relationships" xmlns:m="http://schemas.openxmlformats.org/officeDocument/2006/math" xmlns:v="urn:schemas-microsoft-com:vml" xmlns:wp14="http://schemas.microsoft.com/office/word/2010/wordprocessingDrawing" xmlns:wp="http://schemas.openxmlformats.org/drawingml/2006/wordprocessingDrawing" xmlns:w10="urn:schemas-microsoft-com:office:word" xmlns:w="http://schemas.openxmlformats.org/wordprocessingml/2006/main" xmlns:w14="http://schemas.microsoft.com/office/word/2010/wordml" xmlns:w15="http://schemas.microsoft.com/office/word/2012/wordml" xmlns:w16cid="http://schemas.microsoft.com/office/word/2016/wordml/cid" xmlns:w16se="http://schemas.microsoft.com/office/word/2015/wordml/symex" xmlns:wpg="http://schemas.microsoft.com/office/word/2010/wordprocessingGroup" xmlns:wpi="http://schemas.microsoft.com/office/word/2010/wordprocessingInk" xmlns:wne="http://schemas.microsoft.com/office/word/2006/wordml" xmlns:wps="http://schemas.microsoft.com/office/word/2010/wordprocessingShape" mc:Ignorable="w14 w15 w16se w16cid wp14">
+<w:hdr xmlns:wpc="http://schemas.microsoft.com/office/word/2010/wordprocessingCanvas" xmlns:cx="http://schemas.microsoft.com/office/drawing/2014/chartex" xmlns:cx1="http://schemas.microsoft.com/office/drawing/2015/9/8/chartex" xmlns:cx2="http://schemas.microsoft.com/office/drawing/2015/10/21/chartex" xmlns:cx3="http://schemas.microsoft.com/office/drawing/2016/5/9/chartex" xmlns:cx4="http://schemas.microsoft.com/office/drawing/2016/5/10/chartex" xmlns:cx5="http://schemas.microsoft.com/office/drawing/2016/5/11/chartex" xmlns:cx6="http://schemas.microsoft.com/office/drawing/2016/5/12/chartex" xmlns:cx7="http://schemas.microsoft.com/office/drawing/2016/5/13/chartex" xmlns:cx8="http://schemas.microsoft.com/office/drawing/2016/5/14/chartex" xmlns:mc="http://schemas.openxmlformats.org/markup-compatibility/2006" xmlns:aink="http://schemas.microsoft.com/office/drawing/2016/ink" xmlns:am3d="http://schemas.microsoft.com/office/drawing/2017/model3d" xmlns:o="urn:schemas-microsoft-com:office:office" xmlns:oel="http://schemas.microsoft.com/office/2019/extlst" xmlns:r="http://schemas.openxmlformats.org/officeDocument/2006/relationships" xmlns:m="http://schemas.openxmlformats.org/officeDocument/2006/math" xmlns:v="urn:schemas-microsoft-com:vml" xmlns:wp14="http://schemas.microsoft.com/office/word/2010/wordprocessingDrawing" xmlns:wp="http://schemas.openxmlformats.org/drawingml/2006/wordprocessingDrawing" xmlns:w10="urn:schemas-microsoft-com:office:word" xmlns:w="http://schemas.openxmlformats.org/wordprocessingml/2006/main" xmlns:w14="http://schemas.microsoft.com/office/word/2010/wordml" xmlns:w15="http://schemas.microsoft.com/office/word/2012/wordml" xmlns:w16cex="http://schemas.microsoft.com/office/word/2018/wordml/cex" xmlns:w16cid="http://schemas.microsoft.com/office/word/2016/wordml/cid" xmlns:w16="http://schemas.microsoft.com/office/word/2018/wordml" xmlns:w16sdtdh="http://schemas.microsoft.com/office/word/2020/wordml/sdtdatahash" xmlns:w16se="http://schemas.microsoft.com/office/word/2015/wordml/symex" xmlns:wpg="http://schemas.microsoft.com/office/word/2010/wordprocessingGroup" xmlns:wpi="http://schemas.microsoft.com/office/word/2010/wordprocessingInk" xmlns:wne="http://schemas.microsoft.com/office/word/2006/wordml" xmlns:wps="http://schemas.microsoft.com/office/word/2010/wordprocessingShape" mc:Ignorable="w14 w15 w16se w16cid w16 w16cex w16sdtdh wp14">
   <w:p>
     <w:pPr>
       <w:pStyle w:val="Header"/>
@@ -134,7 +181,7 @@
 </file>
 
 <file path=word/header2.xml><?xml version="1.0" encoding="utf-8"?>
-<w:hdr xmlns:wpc="http://schemas.microsoft.com/office/word/2010/wordprocessingCanvas" xmlns:cx="http://schemas.microsoft.com/office/drawing/2014/chartex" xmlns:cx1="http://schemas.microsoft.com/office/drawing/2015/9/8/chartex" xmlns:cx2="http://schemas.microsoft.com/office/drawing/2015/10/21/chartex" xmlns:cx3="http://schemas.microsoft.com/office/drawing/2016/5/9/chartex" xmlns:cx4="http://schemas.microsoft.com/office/drawing/2016/5/10/chartex" xmlns:cx5="http://schemas.microsoft.com/office/drawing/2016/5/11/chartex" xmlns:cx6="http://schemas.microsoft.com/office/drawing/2016/5/12/chartex" xmlns:cx7="http://schemas.microsoft.com/office/drawing/2016/5/13/chartex" xmlns:cx8="http://schemas.microsoft.com/office/drawing/2016/5/14/chartex" xmlns:mc="http://schemas.openxmlformats.org/markup-compatibility/2006" xmlns:aink="http://schemas.microsoft.com/office/drawing/2016/ink" xmlns:am3d="http://schemas.microsoft.com/office/drawing/2017/model3d" xmlns:o="urn:schemas-microsoft-com:office:office" xmlns:r="http://schemas.openxmlformats.org/officeDocument/2006/relationships" xmlns:m="http://schemas.openxmlformats.org/officeDocument/2006/math" xmlns:v="urn:schemas-microsoft-com:vml" xmlns:wp14="http://schemas.microsoft.com/office/word/2010/wordprocessingDrawing" xmlns:wp="http://schemas.openxmlformats.org/drawingml/2006/wordprocessingDrawing" xmlns:w10="urn:schemas-microsoft-com:office:word" xmlns:w="http://schemas.openxmlformats.org/wordprocessingml/2006/main" xmlns:w14="http://schemas.microsoft.com/office/word/2010/wordml" xmlns:w15="http://schemas.microsoft.com/office/word/2012/wordml" xmlns:w16cid="http://schemas.microsoft.com/office/word/2016/wordml/cid" xmlns:w16se="http://schemas.microsoft.com/office/word/2015/wordml/symex" xmlns:wpg="http://schemas.microsoft.com/office/word/2010/wordprocessingGroup" xmlns:wpi="http://schemas.microsoft.com/office/word/2010/wordprocessingInk" xmlns:wne="http://schemas.microsoft.com/office/word/2006/wordml" xmlns:wps="http://schemas.microsoft.com/office/word/2010/wordprocessingShape" mc:Ignorable="w14 w15 w16se w16cid wp14">
+<w:hdr xmlns:wpc="http://schemas.microsoft.com/office/word/2010/wordprocessingCanvas" xmlns:cx="http://schemas.microsoft.com/office/drawing/2014/chartex" xmlns:cx1="http://schemas.microsoft.com/office/drawing/2015/9/8/chartex" xmlns:cx2="http://schemas.microsoft.com/office/drawing/2015/10/21/chartex" xmlns:cx3="http://schemas.microsoft.com/office/drawing/2016/5/9/chartex" xmlns:cx4="http://schemas.microsoft.com/office/drawing/2016/5/10/chartex" xmlns:cx5="http://schemas.microsoft.com/office/drawing/2016/5/11/chartex" xmlns:cx6="http://schemas.microsoft.com/office/drawing/2016/5/12/chartex" xmlns:cx7="http://schemas.microsoft.com/office/drawing/2016/5/13/chartex" xmlns:cx8="http://schemas.microsoft.com/office/drawing/2016/5/14/chartex" xmlns:mc="http://schemas.openxmlformats.org/markup-compatibility/2006" xmlns:aink="http://schemas.microsoft.com/office/drawing/2016/ink" xmlns:am3d="http://schemas.microsoft.com/office/drawing/2017/model3d" xmlns:o="urn:schemas-microsoft-com:office:office" xmlns:oel="http://schemas.microsoft.com/office/2019/extlst" xmlns:r="http://schemas.openxmlformats.org/officeDocument/2006/relationships" xmlns:m="http://schemas.openxmlformats.org/officeDocument/2006/math" xmlns:v="urn:schemas-microsoft-com:vml" xmlns:wp14="http://schemas.microsoft.com/office/word/2010/wordprocessingDrawing" xmlns:wp="http://schemas.openxmlformats.org/drawingml/2006/wordprocessingDrawing" xmlns:w10="urn:schemas-microsoft-com:office:word" xmlns:w="http://schemas.openxmlformats.org/wordprocessingml/2006/main" xmlns:w14="http://schemas.microsoft.com/office/word/2010/wordml" xmlns:w15="http://schemas.microsoft.com/office/word/2012/wordml" xmlns:w16cex="http://schemas.microsoft.com/office/word/2018/wordml/cex" xmlns:w16cid="http://schemas.microsoft.com/office/word/2016/wordml/cid" xmlns:w16="http://schemas.microsoft.com/office/word/2018/wordml" xmlns:w16sdtdh="http://schemas.microsoft.com/office/word/2020/wordml/sdtdatahash" xmlns:w16se="http://schemas.microsoft.com/office/word/2015/wordml/symex" xmlns:wpg="http://schemas.microsoft.com/office/word/2010/wordprocessingGroup" xmlns:wpi="http://schemas.microsoft.com/office/word/2010/wordprocessingInk" xmlns:wne="http://schemas.microsoft.com/office/word/2006/wordml" xmlns:wps="http://schemas.microsoft.com/office/word/2010/wordprocessingShape" mc:Ignorable="w14 w15 w16se w16cid w16 w16cex w16sdtdh wp14">
   <w:p>
     <w:pPr>
       <w:pStyle w:val="Header"/>
@@ -144,7 +191,7 @@
 </file>
 
 <file path=word/header3.xml><?xml version="1.0" encoding="utf-8"?>
-<w:hdr xmlns:wpc="http://schemas.microsoft.com/office/word/2010/wordprocessingCanvas" xmlns:cx="http://schemas.microsoft.com/office/drawing/2014/chartex" xmlns:cx1="http://schemas.microsoft.com/office/drawing/2015/9/8/chartex" xmlns:cx2="http://schemas.microsoft.com/office/drawing/2015/10/21/chartex" xmlns:cx3="http://schemas.microsoft.com/office/drawing/2016/5/9/chartex" xmlns:cx4="http://schemas.microsoft.com/office/drawing/2016/5/10/chartex" xmlns:cx5="http://schemas.microsoft.com/office/drawing/2016/5/11/chartex" xmlns:cx6="http://schemas.microsoft.com/office/drawing/2016/5/12/chartex" xmlns:cx7="http://schemas.microsoft.com/office/drawing/2016/5/13/chartex" xmlns:cx8="http://schemas.microsoft.com/office/drawing/2016/5/14/chartex" xmlns:mc="http://schemas.openxmlformats.org/markup-compatibility/2006" xmlns:aink="http://schemas.microsoft.com/office/drawing/2016/ink" xmlns:am3d="http://schemas.microsoft.com/office/drawing/2017/model3d" xmlns:o="urn:schemas-microsoft-com:office:office" xmlns:r="http://schemas.openxmlformats.org/officeDocument/2006/relationships" xmlns:m="http://schemas.openxmlformats.org/officeDocument/2006/math" xmlns:v="urn:schemas-microsoft-com:vml" xmlns:wp14="http://schemas.microsoft.com/office/word/2010/wordprocessingDrawing" xmlns:wp="http://schemas.openxmlformats.org/drawingml/2006/wordprocessingDrawing" xmlns:w10="urn:schemas-microsoft-com:office:word" xmlns:w="http://schemas.openxmlformats.org/wordprocessingml/2006/main" xmlns:w14="http://schemas.microsoft.com/office/word/2010/wordml" xmlns:w15="http://schemas.microsoft.com/office/word/2012/wordml" xmlns:w16cid="http://schemas.microsoft.com/office/word/2016/wordml/cid" xmlns:w16se="http://schemas.microsoft.com/office/word/2015/wordml/symex" xmlns:wpg="http://schemas.microsoft.com/office/word/2010/wordprocessingGroup" xmlns:wpi="http://schemas.microsoft.com/office/word/2010/wordprocessingInk" xmlns:wne="http://schemas.microsoft.com/office/word/2006/wordml" xmlns:wps="http://schemas.microsoft.com/office/word/2010/wordprocessingShape" mc:Ignorable="w14 w15 w16se w16cid wp14">
+<w:hdr xmlns:wpc="http://schemas.microsoft.com/office/word/2010/wordprocessingCanvas" xmlns:cx="http://schemas.microsoft.com/office/drawing/2014/chartex" xmlns:cx1="http://schemas.microsoft.com/office/drawing/2015/9/8/chartex" xmlns:cx2="http://schemas.microsoft.com/office/drawing/2015/10/21/chartex" xmlns:cx3="http://schemas.microsoft.com/office/drawing/2016/5/9/chartex" xmlns:cx4="http://schemas.microsoft.com/office/drawing/2016/5/10/chartex" xmlns:cx5="http://schemas.microsoft.com/office/drawing/2016/5/11/chartex" xmlns:cx6="http://schemas.microsoft.com/office/drawing/2016/5/12/chartex" xmlns:cx7="http://schemas.microsoft.com/office/drawing/2016/5/13/chartex" xmlns:cx8="http://schemas.microsoft.com/office/drawing/2016/5/14/chartex" xmlns:mc="http://schemas.openxmlformats.org/markup-compatibility/2006" xmlns:aink="http://schemas.microsoft.com/office/drawing/2016/ink" xmlns:am3d="http://schemas.microsoft.com/office/drawing/2017/model3d" xmlns:o="urn:schemas-microsoft-com:office:office" xmlns:oel="http://schemas.microsoft.com/office/2019/extlst" xmlns:r="http://schemas.openxmlformats.org/officeDocument/2006/relationships" xmlns:m="http://schemas.openxmlformats.org/officeDocument/2006/math" xmlns:v="urn:schemas-microsoft-com:vml" xmlns:wp14="http://schemas.microsoft.com/office/word/2010/wordprocessingDrawing" xmlns:wp="http://schemas.openxmlformats.org/drawingml/2006/wordprocessingDrawing" xmlns:w10="urn:schemas-microsoft-com:office:word" xmlns:w="http://schemas.openxmlformats.org/wordprocessingml/2006/main" xmlns:w14="http://schemas.microsoft.com/office/word/2010/wordml" xmlns:w15="http://schemas.microsoft.com/office/word/2012/wordml" xmlns:w16cex="http://schemas.microsoft.com/office/word/2018/wordml/cex" xmlns:w16cid="http://schemas.microsoft.com/office/word/2016/wordml/cid" xmlns:w16="http://schemas.microsoft.com/office/word/2018/wordml" xmlns:w16sdtdh="http://schemas.microsoft.com/office/word/2020/wordml/sdtdatahash" xmlns:w16se="http://schemas.microsoft.com/office/word/2015/wordml/symex" xmlns:wpg="http://schemas.microsoft.com/office/word/2010/wordprocessingGroup" xmlns:wpi="http://schemas.microsoft.com/office/word/2010/wordprocessingInk" xmlns:wne="http://schemas.microsoft.com/office/word/2006/wordml" xmlns:wps="http://schemas.microsoft.com/office/word/2010/wordprocessingShape" mc:Ignorable="w14 w15 w16se w16cid w16 w16cex w16sdtdh wp14">
   <w:p>
     <w:pPr>
       <w:pStyle w:val="Header"/>
@@ -157,7 +204,7 @@
 </file>
 
 <file path=word/numbering.xml><?xml version="1.0" encoding="utf-8"?>
-<w:numbering xmlns:wpc="http://schemas.microsoft.com/office/word/2010/wordprocessingCanvas" xmlns:cx="http://schemas.microsoft.com/office/drawing/2014/chartex" xmlns:cx1="http://schemas.microsoft.com/office/drawing/2015/9/8/chartex" xmlns:cx2="http://schemas.microsoft.com/office/drawing/2015/10/21/chartex" xmlns:cx3="http://schemas.microsoft.com/office/drawing/2016/5/9/chartex" xmlns:cx4="http://schemas.microsoft.com/office/drawing/2016/5/10/chartex" xmlns:cx5="http://schemas.microsoft.com/office/drawing/2016/5/11/chartex" xmlns:cx6="http://schemas.microsoft.com/office/drawing/2016/5/12/chartex" xmlns:cx7="http://schemas.microsoft.com/office/drawing/2016/5/13/chartex" xmlns:cx8="http://schemas.microsoft.com/office/drawing/2016/5/14/chartex" xmlns:mc="http://schemas.openxmlformats.org/markup-compatibility/2006" xmlns:aink="http://schemas.microsoft.com/office/drawing/2016/ink" xmlns:am3d="http://schemas.microsoft.com/office/drawing/2017/model3d" xmlns:o="urn:schemas-microsoft-com:office:office" xmlns:r="http://schemas.openxmlformats.org/officeDocument/2006/relationships" xmlns:m="http://schemas.openxmlformats.org/officeDocument/2006/math" xmlns:v="urn:schemas-microsoft-com:vml" xmlns:wp14="http://schemas.microsoft.com/office/word/2010/wordprocessingDrawing" xmlns:wp="http://schemas.openxmlformats.org/drawingml/2006/wordprocessingDrawing" xmlns:w10="urn:schemas-microsoft-com:office:word" xmlns:w="http://schemas.openxmlformats.org/wordprocessingml/2006/main" xmlns:w14="http://schemas.microsoft.com/office/word/2010/wordml" xmlns:w15="http://schemas.microsoft.com/office/word/2012/wordml" xmlns:w16cid="http://schemas.microsoft.com/office/word/2016/wordml/cid" xmlns:w16se="http://schemas.microsoft.com/office/word/2015/wordml/symex" xmlns:wpg="http://schemas.microsoft.com/office/word/2010/wordprocessingGroup" xmlns:wpi="http://schemas.microsoft.com/office/word/2010/wordprocessingInk" xmlns:wne="http://schemas.microsoft.com/office/word/2006/wordml" xmlns:wps="http://schemas.microsoft.com/office/word/2010/wordprocessingShape" mc:Ignorable="w14 w15 w16se w16cid wp14">
+<w:numbering xmlns:wpc="http://schemas.microsoft.com/office/word/2010/wordprocessingCanvas" xmlns:cx="http://schemas.microsoft.com/office/drawing/2014/chartex" xmlns:cx1="http://schemas.microsoft.com/office/drawing/2015/9/8/chartex" xmlns:cx2="http://schemas.microsoft.com/office/drawing/2015/10/21/chartex" xmlns:cx3="http://schemas.microsoft.com/office/drawing/2016/5/9/chartex" xmlns:cx4="http://schemas.microsoft.com/office/drawing/2016/5/10/chartex" xmlns:cx5="http://schemas.microsoft.com/office/drawing/2016/5/11/chartex" xmlns:cx6="http://schemas.microsoft.com/office/drawing/2016/5/12/chartex" xmlns:cx7="http://schemas.microsoft.com/office/drawing/2016/5/13/chartex" xmlns:cx8="http://schemas.microsoft.com/office/drawing/2016/5/14/chartex" xmlns:mc="http://schemas.openxmlformats.org/markup-compatibility/2006" xmlns:aink="http://schemas.microsoft.com/office/drawing/2016/ink" xmlns:am3d="http://schemas.microsoft.com/office/drawing/2017/model3d" xmlns:o="urn:schemas-microsoft-com:office:office" xmlns:oel="http://schemas.microsoft.com/office/2019/extlst" xmlns:r="http://schemas.openxmlformats.org/officeDocument/2006/relationships" xmlns:m="http://schemas.openxmlformats.org/officeDocument/2006/math" xmlns:v="urn:schemas-microsoft-com:vml" xmlns:wp14="http://schemas.microsoft.com/office/word/2010/wordprocessingDrawing" xmlns:wp="http://schemas.openxmlformats.org/drawingml/2006/wordprocessingDrawing" xmlns:w10="urn:schemas-microsoft-com:office:word" xmlns:w="http://schemas.openxmlformats.org/wordprocessingml/2006/main" xmlns:w14="http://schemas.microsoft.com/office/word/2010/wordml" xmlns:w15="http://schemas.microsoft.com/office/word/2012/wordml" xmlns:w16cex="http://schemas.microsoft.com/office/word/2018/wordml/cex" xmlns:w16cid="http://schemas.microsoft.com/office/word/2016/wordml/cid" xmlns:w16="http://schemas.microsoft.com/office/word/2018/wordml" xmlns:w16sdtdh="http://schemas.microsoft.com/office/word/2020/wordml/sdtdatahash" xmlns:w16se="http://schemas.microsoft.com/office/word/2015/wordml/symex" xmlns:wpg="http://schemas.microsoft.com/office/word/2010/wordprocessingGroup" xmlns:wpi="http://schemas.microsoft.com/office/word/2010/wordprocessingInk" xmlns:wne="http://schemas.microsoft.com/office/word/2006/wordml" xmlns:wps="http://schemas.microsoft.com/office/word/2010/wordprocessingShape" mc:Ignorable="w14 w15 w16se w16cid w16 w16cex w16sdtdh wp14">
   <w:abstractNum w:abstractNumId="0" w15:restartNumberingAfterBreak="0">
     <w:nsid w:val="2034206F"/>
     <w:multiLevelType w:val="multilevel"/>
@@ -616,53 +663,61 @@
       </w:pPr>
     </w:lvl>
   </w:abstractNum>
-  <w:num w:numId="1">
+  <w:num w:numId="1" w16cid:durableId="1986204494">
     <w:abstractNumId w:val="0"/>
   </w:num>
-  <w:num w:numId="2">
+  <w:num w:numId="2" w16cid:durableId="852718866">
     <w:abstractNumId w:val="0"/>
   </w:num>
-  <w:num w:numId="3">
+  <w:num w:numId="3" w16cid:durableId="1213734127">
     <w:abstractNumId w:val="0"/>
   </w:num>
-  <w:num w:numId="4">
+  <w:num w:numId="4" w16cid:durableId="92630507">
     <w:abstractNumId w:val="0"/>
   </w:num>
-  <w:num w:numId="5">
+  <w:num w:numId="5" w16cid:durableId="1145662743">
     <w:abstractNumId w:val="0"/>
   </w:num>
-  <w:num w:numId="6">
+  <w:num w:numId="6" w16cid:durableId="310865713">
     <w:abstractNumId w:val="0"/>
   </w:num>
-  <w:num w:numId="7">
+  <w:num w:numId="7" w16cid:durableId="675767255">
     <w:abstractNumId w:val="0"/>
   </w:num>
-  <w:num w:numId="8">
+  <w:num w:numId="8" w16cid:durableId="220135628">
     <w:abstractNumId w:val="0"/>
   </w:num>
-  <w:num w:numId="9">
+  <w:num w:numId="9" w16cid:durableId="1469783612">
     <w:abstractNumId w:val="0"/>
   </w:num>
-  <w:num w:numId="10">
+  <w:num w:numId="10" w16cid:durableId="1287203024">
     <w:abstractNumId w:val="3"/>
   </w:num>
-  <w:num w:numId="11">
+  <w:num w:numId="11" w16cid:durableId="1049378199">
     <w:abstractNumId w:val="1"/>
   </w:num>
-  <w:num w:numId="12">
+  <w:num w:numId="12" w16cid:durableId="746079732">
     <w:abstractNumId w:val="2"/>
   </w:num>
-  <w:num w:numId="13">
+  <w:num w:numId="13" w16cid:durableId="412093895">
     <w:abstractNumId w:val="0"/>
   </w:num>
-  <w:num w:numId="14">
+  <w:num w:numId="14" w16cid:durableId="2119835973">
     <w:abstractNumId w:val="0"/>
   </w:num>
 </w:numbering>
 </file>
 
+<file path=word/people.xml><?xml version="1.0" encoding="utf-8"?>
+<w15:people xmlns:wpc="http://schemas.microsoft.com/office/word/2010/wordprocessingCanvas" xmlns:cx="http://schemas.microsoft.com/office/drawing/2014/chartex" xmlns:cx1="http://schemas.microsoft.com/office/drawing/2015/9/8/chartex" xmlns:cx2="http://schemas.microsoft.com/office/drawing/2015/10/21/chartex" xmlns:cx3="http://schemas.microsoft.com/office/drawing/2016/5/9/chartex" xmlns:cx4="http://schemas.microsoft.com/office/drawing/2016/5/10/chartex" xmlns:cx5="http://schemas.microsoft.com/office/drawing/2016/5/11/chartex" xmlns:cx6="http://schemas.microsoft.com/office/drawing/2016/5/12/chartex" xmlns:cx7="http://schemas.microsoft.com/office/drawing/2016/5/13/chartex" xmlns:cx8="http://schemas.microsoft.com/office/drawing/2016/5/14/chartex" xmlns:mc="http://schemas.openxmlformats.org/markup-compatibility/2006" xmlns:aink="http://schemas.microsoft.com/office/drawing/2016/ink" xmlns:am3d="http://schemas.microsoft.com/office/drawing/2017/model3d" xmlns:o="urn:schemas-microsoft-com:office:office" xmlns:oel="http://schemas.microsoft.com/office/2019/extlst" xmlns:r="http://schemas.openxmlformats.org/officeDocument/2006/relationships" xmlns:m="http://schemas.openxmlformats.org/officeDocument/2006/math" xmlns:v="urn:schemas-microsoft-com:vml" xmlns:wp14="http://schemas.microsoft.com/office/word/2010/wordprocessingDrawing" xmlns:wp="http://schemas.openxmlformats.org/drawingml/2006/wordprocessingDrawing" xmlns:w10="urn:schemas-microsoft-com:office:word" xmlns:w="http://schemas.openxmlformats.org/wordprocessingml/2006/main" xmlns:w14="http://schemas.microsoft.com/office/word/2010/wordml" xmlns:w15="http://schemas.microsoft.com/office/word/2012/wordml" xmlns:w16cex="http://schemas.microsoft.com/office/word/2018/wordml/cex" xmlns:w16cid="http://schemas.microsoft.com/office/word/2016/wordml/cid" xmlns:w16="http://schemas.microsoft.com/office/word/2018/wordml" xmlns:w16sdtdh="http://schemas.microsoft.com/office/word/2020/wordml/sdtdatahash" xmlns:w16se="http://schemas.microsoft.com/office/word/2015/wordml/symex" xmlns:wpg="http://schemas.microsoft.com/office/word/2010/wordprocessingGroup" xmlns:wpi="http://schemas.microsoft.com/office/word/2010/wordprocessingInk" xmlns:wne="http://schemas.microsoft.com/office/word/2006/wordml" xmlns:wps="http://schemas.microsoft.com/office/word/2010/wordprocessingShape" mc:Ignorable="w14 w15 w16se w16cid w16 w16cex w16sdtdh wp14">
+  <w15:person w15:author="mohammad amin baghyani">
+    <w15:presenceInfo w15:providerId="Windows Live" w15:userId="5b02769368ade4d3"/>
+  </w15:person>
+</w15:people>
+</file>
+
 <file path=word/styles.xml><?xml version="1.0" encoding="utf-8"?>
-<w:styles xmlns:mc="http://schemas.openxmlformats.org/markup-compatibility/2006" xmlns:r="http://schemas.openxmlformats.org/officeDocument/2006/relationships" xmlns:w="http://schemas.openxmlformats.org/wordprocessingml/2006/main" xmlns:w14="http://schemas.microsoft.com/office/word/2010/wordml" xmlns:w15="http://schemas.microsoft.com/office/word/2012/wordml" xmlns:w16cid="http://schemas.microsoft.com/office/word/2016/wordml/cid" xmlns:w16se="http://schemas.microsoft.com/office/word/2015/wordml/symex" mc:Ignorable="w14 w15 w16se w16cid">
+<w:styles xmlns:mc="http://schemas.openxmlformats.org/markup-compatibility/2006" xmlns:r="http://schemas.openxmlformats.org/officeDocument/2006/relationships" xmlns:w="http://schemas.openxmlformats.org/wordprocessingml/2006/main" xmlns:w14="http://schemas.microsoft.com/office/word/2010/wordml" xmlns:w15="http://schemas.microsoft.com/office/word/2012/wordml" xmlns:w16cex="http://schemas.microsoft.com/office/word/2018/wordml/cex" xmlns:w16cid="http://schemas.microsoft.com/office/word/2016/wordml/cid" xmlns:w16="http://schemas.microsoft.com/office/word/2018/wordml" xmlns:w16sdtdh="http://schemas.microsoft.com/office/word/2020/wordml/sdtdatahash" xmlns:w16se="http://schemas.microsoft.com/office/word/2015/wordml/symex" mc:Ignorable="w14 w15 w16se w16cid w16 w16cex w16sdtdh">
   <w:docDefaults>
     <w:rPrDefault>
       <w:rPr>
@@ -681,7 +736,7 @@
       </w:pPr>
     </w:pPrDefault>
   </w:docDefaults>
-  <w:latentStyles w:defLockedState="0" w:defUIPriority="99" w:defSemiHidden="0" w:defUnhideWhenUsed="0" w:defQFormat="0" w:count="375">
+  <w:latentStyles w:defLockedState="0" w:defUIPriority="99" w:defSemiHidden="0" w:defUnhideWhenUsed="0" w:defQFormat="0" w:count="376">
     <w:lsdException w:name="Normal" w:uiPriority="0" w:qFormat="1"/>
     <w:lsdException w:name="heading 1" w:uiPriority="1" w:qFormat="1"/>
     <w:lsdException w:name="heading 2" w:semiHidden="1" w:uiPriority="1" w:unhideWhenUsed="1" w:qFormat="1"/>
@@ -1057,6 +1112,7 @@
     <w:lsdException w:name="Smart Hyperlink" w:semiHidden="1" w:unhideWhenUsed="1"/>
     <w:lsdException w:name="Hashtag" w:semiHidden="1" w:unhideWhenUsed="1"/>
     <w:lsdException w:name="Unresolved Mention" w:semiHidden="1" w:unhideWhenUsed="1"/>
+    <w:lsdException w:name="Smart Link" w:semiHidden="1" w:unhideWhenUsed="1"/>
   </w:latentStyles>
   <w:style w:type="paragraph" w:default="1" w:styleId="Normal">
     <w:name w:val="Normal"/>

</xml_diff>